<commit_message>
Expand professional experience on the quantitative CV.
Rewrite each role with fuller bullets drawn from the existing work, and keep employers, titles, dates, and stated results unchanged.

Co-authored-by: AswinBinu007 <AswinBinu007@users.noreply.github.com>
</commit_message>
<xml_diff>
--- a/cv/Abhin_Binu_Kumar_CV.docx
+++ b/cv/Abhin_Binu_Kumar_CV.docx
@@ -288,7 +288,7 @@
     </w:p>
     <w:p>
       <w:pPr>
-        <w:spacing w:before="120" w:after="0" w:line="252" w:lineRule="auto"/>
+        <w:spacing w:before="80" w:after="0" w:line="252" w:lineRule="auto"/>
         <w:jc w:val="left"/>
       </w:pPr>
       <w:r>
@@ -329,7 +329,7 @@
     <w:p>
       <w:pPr>
         <w:pStyle w:val="ListBullet"/>
-        <w:spacing w:before="0" w:after="20" w:line="252" w:lineRule="auto"/>
+        <w:spacing w:before="0" w:after="0" w:line="245" w:lineRule="auto"/>
         <w:ind w:left="360"/>
       </w:pPr>
       <w:r>
@@ -339,13 +339,13 @@
           <w:i w:val="0"/>
           <w:sz w:val="21"/>
         </w:rPr>
-        <w:t>Conduct quantitative financial analysis for live projects in hospitality, agriculture, healthcare, automotive, and renewable energy, supporting feasibility studies and investment decisions.</w:t>
+        <w:t>Deliver quantitative financial analysis for live projects in hospitality, agriculture, healthcare, automotive, and renewable energy, and use it in feasibility studies and investment decisions.</w:t>
       </w:r>
     </w:p>
     <w:p>
       <w:pPr>
         <w:pStyle w:val="ListBullet"/>
-        <w:spacing w:before="0" w:after="20" w:line="252" w:lineRule="auto"/>
+        <w:spacing w:before="0" w:after="0" w:line="245" w:lineRule="auto"/>
         <w:ind w:left="360"/>
       </w:pPr>
       <w:r>
@@ -355,13 +355,13 @@
           <w:i w:val="0"/>
           <w:sz w:val="21"/>
         </w:rPr>
-        <w:t>Build and analyse multi-year financial models covering revenue, operating costs, capital expenditure, profitability, and cash-flow dynamics.</w:t>
+        <w:t>Build multi-year financial models of revenue, operating costs, capital expenditure, profitability, and cash flow, with assumptions written so each case can be traced and rerun.</w:t>
       </w:r>
     </w:p>
     <w:p>
       <w:pPr>
         <w:pStyle w:val="ListBullet"/>
-        <w:spacing w:before="0" w:after="20" w:line="252" w:lineRule="auto"/>
+        <w:spacing w:before="0" w:after="0" w:line="245" w:lineRule="auto"/>
         <w:ind w:left="360"/>
       </w:pPr>
       <w:r>
@@ -371,12 +371,44 @@
           <w:i w:val="0"/>
           <w:sz w:val="21"/>
         </w:rPr>
-        <w:t>Use Python and Excel for scenario analysis of financing assumptions, including break-even points and debt service coverage ratio (DSCR) sensitivity, and compare project viability across those cases.</w:t>
+        <w:t>Run scenario analysis in Python and Excel on financing assumptions, including break-even points and debt service coverage ratio (DSCR) sensitivity.</w:t>
       </w:r>
     </w:p>
     <w:p>
       <w:pPr>
-        <w:spacing w:before="120" w:after="0" w:line="252" w:lineRule="auto"/>
+        <w:pStyle w:val="ListBullet"/>
+        <w:spacing w:before="0" w:after="0" w:line="245" w:lineRule="auto"/>
+        <w:ind w:left="360"/>
+      </w:pPr>
+      <w:r>
+        <w:rPr>
+          <w:rFonts w:ascii="Calibri" w:hAnsi="Calibri" w:eastAsia="Calibri"/>
+          <w:b w:val="0"/>
+          <w:i w:val="0"/>
+          <w:sz w:val="21"/>
+        </w:rPr>
+        <w:t>Compare operating and financing cases on profitability and cash flow, and separate the cases that support an investment from the cases that do not.</w:t>
+      </w:r>
+    </w:p>
+    <w:p>
+      <w:pPr>
+        <w:pStyle w:val="ListBullet"/>
+        <w:spacing w:before="0" w:after="0" w:line="245" w:lineRule="auto"/>
+        <w:ind w:left="360"/>
+      </w:pPr>
+      <w:r>
+        <w:rPr>
+          <w:rFonts w:ascii="Calibri" w:hAnsi="Calibri" w:eastAsia="Calibri"/>
+          <w:b w:val="0"/>
+          <w:i w:val="0"/>
+          <w:sz w:val="21"/>
+        </w:rPr>
+        <w:t>Check revenue, cost, and cash-flow lines against each other inside each model before the figures are used in a feasibility discussion.</w:t>
+      </w:r>
+    </w:p>
+    <w:p>
+      <w:pPr>
+        <w:spacing w:before="80" w:after="0" w:line="252" w:lineRule="auto"/>
         <w:jc w:val="left"/>
       </w:pPr>
       <w:r>
@@ -417,7 +449,7 @@
     <w:p>
       <w:pPr>
         <w:pStyle w:val="ListBullet"/>
-        <w:spacing w:before="0" w:after="20" w:line="252" w:lineRule="auto"/>
+        <w:spacing w:before="0" w:after="0" w:line="245" w:lineRule="auto"/>
         <w:ind w:left="360"/>
       </w:pPr>
       <w:r>
@@ -427,13 +459,13 @@
           <w:i w:val="0"/>
           <w:sz w:val="21"/>
         </w:rPr>
-        <w:t>Worked on large-scale optimisation and constrained decision-making for fleet management systems.</w:t>
+        <w:t>Replaced an MILP fleet-assignment solver with a C++ Branch and Bound pipeline and pruning rules, improving system throughput by 18%.</w:t>
       </w:r>
     </w:p>
     <w:p>
       <w:pPr>
         <w:pStyle w:val="ListBullet"/>
-        <w:spacing w:before="0" w:after="20" w:line="252" w:lineRule="auto"/>
+        <w:spacing w:before="0" w:after="0" w:line="245" w:lineRule="auto"/>
         <w:ind w:left="360"/>
       </w:pPr>
       <w:r>
@@ -443,13 +475,13 @@
           <w:i w:val="0"/>
           <w:sz w:val="21"/>
         </w:rPr>
-        <w:t>Designed and implemented an optimal assignment algorithm using Branch and Bound, with a cost function covering distance, congestion, and fairness.</w:t>
+        <w:t>Designed the assignment algorithm for constrained fleet decisions, with a cost function covering distance, congestion, and fairness.</w:t>
       </w:r>
     </w:p>
     <w:p>
       <w:pPr>
         <w:pStyle w:val="ListBullet"/>
-        <w:spacing w:before="0" w:after="20" w:line="252" w:lineRule="auto"/>
+        <w:spacing w:before="0" w:after="0" w:line="245" w:lineRule="auto"/>
         <w:ind w:left="360"/>
       </w:pPr>
       <w:r>
@@ -459,13 +491,13 @@
           <w:i w:val="0"/>
           <w:sz w:val="21"/>
         </w:rPr>
-        <w:t>Implemented the optimisation pipeline in C++, developing pruning strategies that replaced an MILP-based solver and improved system throughput by 18%.</w:t>
+        <w:t>Wrote pruning rules that discarded branches unable to improve the best feasible assignment, which is what allowed the custom solver to replace the MILP model.</w:t>
       </w:r>
     </w:p>
     <w:p>
       <w:pPr>
         <w:pStyle w:val="ListBullet"/>
-        <w:spacing w:before="0" w:after="20" w:line="252" w:lineRule="auto"/>
+        <w:spacing w:before="0" w:after="0" w:line="245" w:lineRule="auto"/>
         <w:ind w:left="360"/>
       </w:pPr>
       <w:r>
@@ -475,12 +507,12 @@
           <w:i w:val="0"/>
           <w:sz w:val="21"/>
         </w:rPr>
-        <w:t>Analysed optimality–efficiency trade-offs between the Branch and Bound solver and the previous MILP approach.</w:t>
+        <w:t>Compared solution quality and runtime with the previous MILP solver and set out the optimality–efficiency trade-off.</w:t>
       </w:r>
     </w:p>
     <w:p>
       <w:pPr>
-        <w:spacing w:before="120" w:after="0" w:line="252" w:lineRule="auto"/>
+        <w:spacing w:before="80" w:after="0" w:line="252" w:lineRule="auto"/>
         <w:jc w:val="left"/>
       </w:pPr>
       <w:r>
@@ -521,7 +553,7 @@
     <w:p>
       <w:pPr>
         <w:pStyle w:val="ListBullet"/>
-        <w:spacing w:before="0" w:after="20" w:line="252" w:lineRule="auto"/>
+        <w:spacing w:before="0" w:after="0" w:line="245" w:lineRule="auto"/>
         <w:ind w:left="360"/>
       </w:pPr>
       <w:r>
@@ -531,13 +563,13 @@
           <w:i w:val="0"/>
           <w:sz w:val="21"/>
         </w:rPr>
-        <w:t>Designed and implemented a PATE-GAN framework by integrating Private Aggregation of Teacher Ensembles (PATE) with generative models to produce synthetic datasets with formal differential privacy guarantees.</w:t>
+        <w:t>Designed a PATE-GAN pipeline that combines Private Aggregation of Teacher Ensembles with a generative model to produce synthetic datasets under a formal differential-privacy guarantee.</w:t>
       </w:r>
     </w:p>
     <w:p>
       <w:pPr>
         <w:pStyle w:val="ListBullet"/>
-        <w:spacing w:before="0" w:after="20" w:line="252" w:lineRule="auto"/>
+        <w:spacing w:before="0" w:after="0" w:line="245" w:lineRule="auto"/>
         <w:ind w:left="360"/>
       </w:pPr>
       <w:r>
@@ -547,13 +579,13 @@
           <w:i w:val="0"/>
           <w:sz w:val="21"/>
         </w:rPr>
-        <w:t>Evaluated privacy–utility trade-offs using statistical and distributional metrics on sensitive datasets, including finance-related data.</w:t>
+        <w:t>Measured the privacy–utility trade-off with statistical and distributional metrics on sensitive datasets, including finance-related data.</w:t>
       </w:r>
     </w:p>
     <w:p>
       <w:pPr>
         <w:pStyle w:val="ListBullet"/>
-        <w:spacing w:before="0" w:after="20" w:line="252" w:lineRule="auto"/>
+        <w:spacing w:before="0" w:after="0" w:line="245" w:lineRule="auto"/>
         <w:ind w:left="360"/>
       </w:pPr>
       <w:r>
@@ -563,13 +595,13 @@
           <w:i w:val="0"/>
           <w:sz w:val="21"/>
         </w:rPr>
-        <w:t>Focused on privacy-aware machine learning and collaborated with researchers on responsible AI deployment.</w:t>
+        <w:t>Worked with researchers on responsible use of the synthetic data, so later analysis could proceed without exposing the underlying records.</w:t>
       </w:r>
     </w:p>
     <w:p>
       <w:pPr>
         <w:pStyle w:val="ListBullet"/>
-        <w:spacing w:before="0" w:after="20" w:line="252" w:lineRule="auto"/>
+        <w:spacing w:before="0" w:after="0" w:line="245" w:lineRule="auto"/>
         <w:ind w:left="360"/>
       </w:pPr>
       <w:r>
@@ -579,12 +611,12 @@
           <w:i w:val="0"/>
           <w:sz w:val="21"/>
         </w:rPr>
-        <w:t>Presented the work at the Symposium on Data for Public Good, Indian Institute of Science (IISc) Bangalore.</w:t>
+        <w:t>Presented the results at the Symposium on Data for Public Good, Indian Institute of Science (IISc) Bangalore.</w:t>
       </w:r>
     </w:p>
     <w:p>
       <w:pPr>
-        <w:spacing w:before="120" w:after="0" w:line="252" w:lineRule="auto"/>
+        <w:spacing w:before="80" w:after="0" w:line="252" w:lineRule="auto"/>
         <w:jc w:val="left"/>
       </w:pPr>
       <w:r>
@@ -625,7 +657,7 @@
     <w:p>
       <w:pPr>
         <w:pStyle w:val="ListBullet"/>
-        <w:spacing w:before="0" w:after="20" w:line="252" w:lineRule="auto"/>
+        <w:spacing w:before="0" w:after="0" w:line="245" w:lineRule="auto"/>
         <w:ind w:left="360"/>
       </w:pPr>
       <w:r>
@@ -640,7 +672,23 @@
     </w:p>
     <w:p>
       <w:pPr>
-        <w:spacing w:before="120" w:after="0" w:line="252" w:lineRule="auto"/>
+        <w:pStyle w:val="ListBullet"/>
+        <w:spacing w:before="0" w:after="0" w:line="245" w:lineRule="auto"/>
+        <w:ind w:left="360"/>
+      </w:pPr>
+      <w:r>
+        <w:rPr>
+          <w:rFonts w:ascii="Calibri" w:hAnsi="Calibri" w:eastAsia="Calibri"/>
+          <w:b w:val="0"/>
+          <w:i w:val="0"/>
+          <w:sz w:val="21"/>
+        </w:rPr>
+        <w:t>Worked through eigenstructure and matrix-decomposition problems so students could apply the methods, not only recall the definitions.</w:t>
+      </w:r>
+    </w:p>
+    <w:p>
+      <w:pPr>
+        <w:spacing w:before="80" w:after="0" w:line="252" w:lineRule="auto"/>
         <w:jc w:val="left"/>
       </w:pPr>
       <w:r>
@@ -681,7 +729,7 @@
     <w:p>
       <w:pPr>
         <w:pStyle w:val="ListBullet"/>
-        <w:spacing w:before="0" w:after="20" w:line="252" w:lineRule="auto"/>
+        <w:spacing w:before="0" w:after="0" w:line="245" w:lineRule="auto"/>
         <w:ind w:left="360"/>
       </w:pPr>
       <w:r>
@@ -691,13 +739,13 @@
           <w:i w:val="0"/>
           <w:sz w:val="21"/>
         </w:rPr>
-        <w:t>Analysed churn behaviour in datasets of more than 6 million customers using statistical modelling, exploratory data analysis, and time-series techniques.</w:t>
+        <w:t>Analysed churn across more than 6 million customer records using statistical modelling, exploratory data analysis, and time-series methods.</w:t>
       </w:r>
     </w:p>
     <w:p>
       <w:pPr>
         <w:pStyle w:val="ListBullet"/>
-        <w:spacing w:before="0" w:after="20" w:line="252" w:lineRule="auto"/>
+        <w:spacing w:before="0" w:after="0" w:line="245" w:lineRule="auto"/>
         <w:ind w:left="360"/>
       </w:pPr>
       <w:r>
@@ -707,7 +755,23 @@
           <w:i w:val="0"/>
           <w:sz w:val="21"/>
         </w:rPr>
-        <w:t>Performed feature analysis and anomaly detection on large-scale telecom data using Python pipelines built for high-volume, noisy datasets.</w:t>
+        <w:t>Built Python pipelines for feature analysis and anomaly detection on high-volume, noisy telecom data.</w:t>
+      </w:r>
+    </w:p>
+    <w:p>
+      <w:pPr>
+        <w:pStyle w:val="ListBullet"/>
+        <w:spacing w:before="0" w:after="0" w:line="245" w:lineRule="auto"/>
+        <w:ind w:left="360"/>
+      </w:pPr>
+      <w:r>
+        <w:rPr>
+          <w:rFonts w:ascii="Calibri" w:hAnsi="Calibri" w:eastAsia="Calibri"/>
+          <w:b w:val="0"/>
+          <w:i w:val="0"/>
+          <w:sz w:val="21"/>
+        </w:rPr>
+        <w:t>Separated unusual customer behaviour from noise in that telecom data so churn patterns could be reviewed across the full customer base.</w:t>
       </w:r>
     </w:p>
     <w:p>
@@ -771,7 +835,7 @@
     <w:p>
       <w:pPr>
         <w:pStyle w:val="ListBullet"/>
-        <w:spacing w:before="0" w:after="20" w:line="252" w:lineRule="auto"/>
+        <w:spacing w:before="0" w:after="0" w:line="245" w:lineRule="auto"/>
         <w:ind w:left="360"/>
       </w:pPr>
       <w:r>
@@ -787,7 +851,7 @@
     <w:p>
       <w:pPr>
         <w:pStyle w:val="ListBullet"/>
-        <w:spacing w:before="0" w:after="20" w:line="252" w:lineRule="auto"/>
+        <w:spacing w:before="0" w:after="0" w:line="245" w:lineRule="auto"/>
         <w:ind w:left="360"/>
       </w:pPr>
       <w:r>
@@ -797,23 +861,7 @@
           <w:i w:val="0"/>
           <w:sz w:val="21"/>
         </w:rPr>
-        <w:t>Applied matrix assembly, decomposition, and stability analysis to large linear systems.</w:t>
-      </w:r>
-    </w:p>
-    <w:p>
-      <w:pPr>
-        <w:pStyle w:val="ListBullet"/>
-        <w:spacing w:before="0" w:after="20" w:line="252" w:lineRule="auto"/>
-        <w:ind w:left="360"/>
-      </w:pPr>
-      <w:r>
-        <w:rPr>
-          <w:rFonts w:ascii="Calibri" w:hAnsi="Calibri" w:eastAsia="Calibri"/>
-          <w:b w:val="0"/>
-          <w:i w:val="0"/>
-          <w:sz w:val="21"/>
-        </w:rPr>
-        <w:t>Conducted stability, convergence, and error analysis for the numerical schemes.</w:t>
+        <w:t>Assembled and decomposed large linear systems, then ran stability, convergence, and error analysis on the numerical schemes.</w:t>
       </w:r>
     </w:p>
     <w:p>
@@ -859,7 +907,7 @@
     <w:p>
       <w:pPr>
         <w:pStyle w:val="ListBullet"/>
-        <w:spacing w:before="0" w:after="20" w:line="252" w:lineRule="auto"/>
+        <w:spacing w:before="0" w:after="0" w:line="245" w:lineRule="auto"/>
         <w:ind w:left="360"/>
       </w:pPr>
       <w:r>
@@ -875,7 +923,7 @@
     <w:p>
       <w:pPr>
         <w:pStyle w:val="ListBullet"/>
-        <w:spacing w:before="0" w:after="20" w:line="252" w:lineRule="auto"/>
+        <w:spacing w:before="0" w:after="0" w:line="245" w:lineRule="auto"/>
         <w:ind w:left="360"/>
       </w:pPr>
       <w:r>
@@ -891,7 +939,7 @@
     <w:p>
       <w:pPr>
         <w:pStyle w:val="ListBullet"/>
-        <w:spacing w:before="0" w:after="20" w:line="252" w:lineRule="auto"/>
+        <w:spacing w:before="0" w:after="0" w:line="245" w:lineRule="auto"/>
         <w:ind w:left="360"/>
       </w:pPr>
       <w:r>
@@ -947,7 +995,7 @@
     <w:p>
       <w:pPr>
         <w:pStyle w:val="ListBullet"/>
-        <w:spacing w:before="0" w:after="20" w:line="252" w:lineRule="auto"/>
+        <w:spacing w:before="0" w:after="0" w:line="245" w:lineRule="auto"/>
         <w:ind w:left="360"/>
       </w:pPr>
       <w:r>
@@ -963,7 +1011,7 @@
     <w:p>
       <w:pPr>
         <w:pStyle w:val="ListBullet"/>
-        <w:spacing w:before="0" w:after="20" w:line="252" w:lineRule="auto"/>
+        <w:spacing w:before="0" w:after="0" w:line="245" w:lineRule="auto"/>
         <w:ind w:left="360"/>
       </w:pPr>
       <w:r>
@@ -979,7 +1027,7 @@
     <w:p>
       <w:pPr>
         <w:pStyle w:val="ListBullet"/>
-        <w:spacing w:before="0" w:after="20" w:line="252" w:lineRule="auto"/>
+        <w:spacing w:before="0" w:after="0" w:line="245" w:lineRule="auto"/>
         <w:ind w:left="360"/>
       </w:pPr>
       <w:r>
@@ -1125,7 +1173,7 @@
     <w:p>
       <w:pPr>
         <w:pStyle w:val="ListBullet"/>
-        <w:spacing w:before="0" w:after="20" w:line="252" w:lineRule="auto"/>
+        <w:spacing w:before="0" w:after="0" w:line="245" w:lineRule="auto"/>
         <w:ind w:left="360"/>
       </w:pPr>
       <w:r>
@@ -1141,7 +1189,7 @@
     <w:p>
       <w:pPr>
         <w:pStyle w:val="ListBullet"/>
-        <w:spacing w:before="0" w:after="20" w:line="252" w:lineRule="auto"/>
+        <w:spacing w:before="0" w:after="0" w:line="245" w:lineRule="auto"/>
         <w:ind w:left="360"/>
       </w:pPr>
       <w:r>
@@ -1157,7 +1205,7 @@
     <w:p>
       <w:pPr>
         <w:pStyle w:val="ListBullet"/>
-        <w:spacing w:before="0" w:after="20" w:line="252" w:lineRule="auto"/>
+        <w:spacing w:before="0" w:after="0" w:line="245" w:lineRule="auto"/>
         <w:ind w:left="360"/>
       </w:pPr>
       <w:r>
@@ -1173,7 +1221,7 @@
     <w:p>
       <w:pPr>
         <w:pStyle w:val="ListBullet"/>
-        <w:spacing w:before="0" w:after="20" w:line="252" w:lineRule="auto"/>
+        <w:spacing w:before="0" w:after="0" w:line="245" w:lineRule="auto"/>
         <w:ind w:left="360"/>
       </w:pPr>
       <w:r>
@@ -1264,7 +1312,7 @@
     <w:p>
       <w:pPr>
         <w:pStyle w:val="ListBullet"/>
-        <w:spacing w:before="0" w:after="20" w:line="252" w:lineRule="auto"/>
+        <w:spacing w:before="0" w:after="0" w:line="245" w:lineRule="auto"/>
         <w:ind w:left="360"/>
       </w:pPr>
       <w:r>
@@ -1280,7 +1328,7 @@
     <w:p>
       <w:pPr>
         <w:pStyle w:val="ListBullet"/>
-        <w:spacing w:before="0" w:after="20" w:line="252" w:lineRule="auto"/>
+        <w:spacing w:before="0" w:after="0" w:line="245" w:lineRule="auto"/>
         <w:ind w:left="360"/>
       </w:pPr>
       <w:r>
@@ -1296,7 +1344,7 @@
     <w:p>
       <w:pPr>
         <w:pStyle w:val="ListBullet"/>
-        <w:spacing w:before="0" w:after="20" w:line="252" w:lineRule="auto"/>
+        <w:spacing w:before="0" w:after="0" w:line="245" w:lineRule="auto"/>
         <w:ind w:left="360"/>
       </w:pPr>
       <w:r>
@@ -1312,7 +1360,7 @@
     <w:p>
       <w:pPr>
         <w:pStyle w:val="ListBullet"/>
-        <w:spacing w:before="0" w:after="20" w:line="252" w:lineRule="auto"/>
+        <w:spacing w:before="0" w:after="0" w:line="245" w:lineRule="auto"/>
         <w:ind w:left="360"/>
       </w:pPr>
       <w:r>

</xml_diff>

<commit_message>
Expand the Addverb role to eight bullets.
Split the fleet-optimisation work into separate points for the assignment model, cost function, C++ pipeline, pruning, the 18% throughput gain, and the MILP comparison.

Co-authored-by: AswinBinu007 <AswinBinu007@users.noreply.github.com>
</commit_message>
<xml_diff>
--- a/cv/Abhin_Binu_Kumar_CV.docx
+++ b/cv/Abhin_Binu_Kumar_CV.docx
@@ -459,7 +459,7 @@
           <w:i w:val="0"/>
           <w:sz w:val="21"/>
         </w:rPr>
-        <w:t>Replaced an MILP fleet-assignment solver with a C++ Branch and Bound pipeline and pruning rules, improving system throughput by 18%.</w:t>
+        <w:t>Worked on large-scale optimisation and constrained decision-making for fleet management systems.</w:t>
       </w:r>
     </w:p>
     <w:p>
@@ -475,7 +475,7 @@
           <w:i w:val="0"/>
           <w:sz w:val="21"/>
         </w:rPr>
-        <w:t>Designed the assignment algorithm for constrained fleet decisions, with a cost function covering distance, congestion, and fairness.</w:t>
+        <w:t>Formulated fleet assignment as a constrained optimisation problem for allocation decisions across the fleet.</w:t>
       </w:r>
     </w:p>
     <w:p>
@@ -491,7 +491,7 @@
           <w:i w:val="0"/>
           <w:sz w:val="21"/>
         </w:rPr>
-        <w:t>Wrote pruning rules that discarded branches unable to improve the best feasible assignment, which is what allowed the custom solver to replace the MILP model.</w:t>
+        <w:t>Designed an optimal assignment algorithm using Branch and Bound.</w:t>
       </w:r>
     </w:p>
     <w:p>
@@ -507,7 +507,71 @@
           <w:i w:val="0"/>
           <w:sz w:val="21"/>
         </w:rPr>
-        <w:t>Compared solution quality and runtime with the previous MILP solver and set out the optimality–efficiency trade-off.</w:t>
+        <w:t>Built the cost function from distance, congestion, and fairness, so all three entered the same objective.</w:t>
+      </w:r>
+    </w:p>
+    <w:p>
+      <w:pPr>
+        <w:pStyle w:val="ListBullet"/>
+        <w:spacing w:before="0" w:after="0" w:line="245" w:lineRule="auto"/>
+        <w:ind w:left="360"/>
+      </w:pPr>
+      <w:r>
+        <w:rPr>
+          <w:rFonts w:ascii="Calibri" w:hAnsi="Calibri" w:eastAsia="Calibri"/>
+          <w:b w:val="0"/>
+          <w:i w:val="0"/>
+          <w:sz w:val="21"/>
+        </w:rPr>
+        <w:t>Implemented the optimisation pipeline in C++, from cost evaluation through the search to the chosen assignment.</w:t>
+      </w:r>
+    </w:p>
+    <w:p>
+      <w:pPr>
+        <w:pStyle w:val="ListBullet"/>
+        <w:spacing w:before="0" w:after="0" w:line="245" w:lineRule="auto"/>
+        <w:ind w:left="360"/>
+      </w:pPr>
+      <w:r>
+        <w:rPr>
+          <w:rFonts w:ascii="Calibri" w:hAnsi="Calibri" w:eastAsia="Calibri"/>
+          <w:b w:val="0"/>
+          <w:i w:val="0"/>
+          <w:sz w:val="21"/>
+        </w:rPr>
+        <w:t>Developed pruning strategies that discarded branches unable to improve the best feasible assignment.</w:t>
+      </w:r>
+    </w:p>
+    <w:p>
+      <w:pPr>
+        <w:pStyle w:val="ListBullet"/>
+        <w:spacing w:before="0" w:after="0" w:line="245" w:lineRule="auto"/>
+        <w:ind w:left="360"/>
+      </w:pPr>
+      <w:r>
+        <w:rPr>
+          <w:rFonts w:ascii="Calibri" w:hAnsi="Calibri" w:eastAsia="Calibri"/>
+          <w:b w:val="0"/>
+          <w:i w:val="0"/>
+          <w:sz w:val="21"/>
+        </w:rPr>
+        <w:t>Replaced the previous MILP-based solver with this pipeline and improved system throughput by 18%.</w:t>
+      </w:r>
+    </w:p>
+    <w:p>
+      <w:pPr>
+        <w:pStyle w:val="ListBullet"/>
+        <w:spacing w:before="0" w:after="0" w:line="245" w:lineRule="auto"/>
+        <w:ind w:left="360"/>
+      </w:pPr>
+      <w:r>
+        <w:rPr>
+          <w:rFonts w:ascii="Calibri" w:hAnsi="Calibri" w:eastAsia="Calibri"/>
+          <w:b w:val="0"/>
+          <w:i w:val="0"/>
+          <w:sz w:val="21"/>
+        </w:rPr>
+        <w:t>Analysed the optimality–efficiency trade-off between the Branch and Bound solver and the MILP solver.</w:t>
       </w:r>
     </w:p>
     <w:p>

</xml_diff>